<commit_message>
docs: ajusta ECUD y manual según la revisión final y corrige cifras de pruebas
CU-10 aclara que una unidad de otra categoría responde DATA-001; CU-05 y CU-07 listan todos los casos que los incluyen; el manual corrige el cliente web y móvil; README usa las cifras de los reportes surefire (342 servidor, 318 consola).
</commit_message>
<xml_diff>
--- a/01. UML/02. ECUD/ECUD_CONVERSION_UNIDADES_GR05_CORREGIDO.docx
+++ b/01. UML/02. ECUD/ECUD_CONVERSION_UNIDADES_GR05_CORREGIDO.docx
@@ -11347,7 +11347,7 @@
               <w:cnfStyle w:val="000000100000" w:firstRow="0" w:lastRow="0" w:firstColumn="0" w:lastColumn="0" w:oddVBand="0" w:evenVBand="0" w:oddHBand="1" w:evenHBand="0" w:firstRowFirstColumn="0" w:firstRowLastColumn="0" w:lastRowFirstColumn="0" w:lastRowLastColumn="0"/>
             </w:pPr>
             <w:r>
-              <w:t xml:space="preserve">Caso de uso interno, incluido por CU-04, que verifica que el token recibido en la solicitud exista en la memoria del servidor y que no haya caducado. No es invocado directamente por el usuario. </w:t>
+              <w:t xml:space="preserve">Caso de uso interno, incluido por CU-02, CU-03 y CU-04, que verifica que el token recibido en la solicitud exista en la memoria del servidor y que no haya caducado. No es invocado directamente por el usuario. </w:t>
             </w:r>
           </w:p>
         </w:tc>
@@ -13989,7 +13989,7 @@
               <w:cnfStyle w:val="000000100000" w:firstRow="0" w:lastRow="0" w:firstColumn="0" w:lastColumn="0" w:oddVBand="0" w:evenVBand="0" w:oddHBand="1" w:evenHBand="0" w:firstRowFirstColumn="0" w:firstRowLastColumn="0" w:lastRowFirstColumn="0" w:lastRowLastColumn="0"/>
             </w:pPr>
             <w:r>
-              <w:t xml:space="preserve">Caso de uso interno, incluido por CU-04, que arma la respuesta que el sistema devuelve al cliente con un formato único, tanto en éxito como en error. No es invocado directamente por el usuario. </w:t>
+              <w:t xml:space="preserve">Caso de uso interno, incluido por CU-01, CU-02, CU-03 y CU-04, que arma la respuesta que el sistema devuelve al cliente con un formato único, tanto en éxito como en error. No es invocado directamente por el usuario. </w:t>
             </w:r>
           </w:p>
         </w:tc>
@@ -17513,7 +17513,7 @@
               <w:cnfStyle w:val="000000100000" w:firstRow="0" w:lastRow="0" w:firstColumn="0" w:lastColumn="0" w:oddVBand="0" w:evenVBand="0" w:oddHBand="1" w:evenHBand="0" w:firstRowFirstColumn="0" w:firstRowLastColumn="0" w:lastRowFirstColumn="0" w:lastRowLastColumn="0"/>
             </w:pPr>
             <w:r>
-              <w:t>Caso de uso de extensión invocado cuando la unidad de origen o la de destino no pertenece al catálogo de la categoría solicitada. Devuelve el código UNIT-001 o UNIT-002 sin ejecutar la conversión.</w:t>
+              <w:t>Caso de uso de extensión invocado cuando la unidad de origen o la de destino no existe en ningún catálogo. Si la unidad existe pero pertenece a otra categoría, se responde DATA-001 (CU-11). Devuelve el código UNIT-001 o UNIT-002 sin ejecutar la conversión.</w:t>
             </w:r>
           </w:p>
         </w:tc>

</xml_diff>